<commit_message>
Final commit. Good night.
</commit_message>
<xml_diff>
--- a/wildyr_assignment2.docx
+++ b/wildyr_assignment2.docx
@@ -1168,23 +1168,7 @@
           <w:bCs/>
           <w:lang w:val="en-GB"/>
         </w:rPr>
-        <w:t xml:space="preserve">their time point and treatment status. Mock samples are well clustered at every time point. Infected samples are only well clustered at the </w:t>
-      </w:r>
-      <w:proofErr w:type="gramStart"/>
-      <w:r>
-        <w:rPr>
-          <w:bCs/>
-          <w:lang w:val="en-GB"/>
-        </w:rPr>
-        <w:t>48 hour</w:t>
-      </w:r>
-      <w:proofErr w:type="gramEnd"/>
-      <w:r>
-        <w:rPr>
-          <w:bCs/>
-          <w:lang w:val="en-GB"/>
-        </w:rPr>
-        <w:t xml:space="preserve"> time point.</w:t>
+        <w:t>their time point and treatment status. Mock samples are well clustered at every time point. Infected samples are only well clustered at the 48 hour time point.</w:t>
       </w:r>
     </w:p>
     <w:p>
@@ -1208,7 +1192,7 @@
           <w:b/>
         </w:rPr>
         <w:drawing>
-          <wp:inline distT="0" distB="0" distL="0" distR="0" wp14:anchorId="5BD26E15" wp14:editId="11AD232C">
+          <wp:inline distT="0" distB="0" distL="0" distR="0" wp14:anchorId="5BD26E15" wp14:editId="3A996553">
             <wp:extent cx="5943600" cy="3423920"/>
             <wp:effectExtent l="0" t="0" r="0" b="5080"/>
             <wp:docPr id="417973705" name="Picture 12" descr="A graph of a virus&#10;&#10;Description automatically generated with medium confidence"/>
@@ -1296,7 +1280,6 @@
         </w:rPr>
         <w:t xml:space="preserve"> value &lt;0.05 and log fold change </w:t>
       </w:r>
-      <w:proofErr w:type="gramStart"/>
       <w:r>
         <w:rPr>
           <w:bCs/>
@@ -1304,7 +1287,6 @@
         </w:rPr>
         <w:t>of  &gt;</w:t>
       </w:r>
-      <w:proofErr w:type="gramEnd"/>
       <w:r>
         <w:rPr>
           <w:bCs/>
@@ -1489,9 +1471,9 @@
           <w:lang w:val="en-GB"/>
         </w:rPr>
         <w:drawing>
-          <wp:inline distT="0" distB="0" distL="0" distR="0" wp14:anchorId="6D2DC9C7" wp14:editId="7D684AAB">
+          <wp:inline distT="0" distB="0" distL="0" distR="0" wp14:anchorId="6D2DC9C7" wp14:editId="390BCF08">
             <wp:extent cx="5943600" cy="5283200"/>
-            <wp:effectExtent l="0" t="0" r="0" b="0"/>
+            <wp:effectExtent l="0" t="0" r="0" b="9525"/>
             <wp:docPr id="1482602771" name="Picture 16" descr="A screenshot of a data analysis&#10;&#10;Description automatically generated"/>
             <wp:cNvGraphicFramePr>
               <a:graphicFrameLocks xmlns:a="http://schemas.openxmlformats.org/drawingml/2006/main" noChangeAspect="1"/>
@@ -1555,7 +1537,6 @@
         <w:t xml:space="preserve">Fig. 4. Top 10 down-regulated pathways ordered by </w:t>
       </w:r>
       <w:proofErr w:type="spellStart"/>
-      <w:proofErr w:type="gramStart"/>
       <w:r>
         <w:rPr>
           <w:b/>
@@ -1564,7 +1545,6 @@
         <w:t>p.adjust</w:t>
       </w:r>
       <w:proofErr w:type="spellEnd"/>
-      <w:proofErr w:type="gramEnd"/>
       <w:r>
         <w:rPr>
           <w:b/>
@@ -1678,23 +1658,7 @@
           <w:bCs/>
           <w:lang w:val="en-GB"/>
         </w:rPr>
-        <w:t xml:space="preserve">The role of the ACE2 gene appears to be important to the virus’s early survival in the host cell as it is the most down-regulated gene across the 4- and 12-hour samples. With the disappearance of the </w:t>
-      </w:r>
-      <w:proofErr w:type="gramStart"/>
-      <w:r>
-        <w:rPr>
-          <w:bCs/>
-          <w:lang w:val="en-GB"/>
-        </w:rPr>
-        <w:t>down-regulation</w:t>
-      </w:r>
-      <w:proofErr w:type="gramEnd"/>
-      <w:r>
-        <w:rPr>
-          <w:bCs/>
-          <w:lang w:val="en-GB"/>
-        </w:rPr>
-        <w:t xml:space="preserve"> in older samples we don’t know the point at which the infection stops having the affect on the gene. There could be a key time frame in which ACE2 has to stay suppressed for the virus to establish itself.</w:t>
+        <w:t>The role of the ACE2 gene appears to be important to the virus’s early survival in the host cell as it is the most down-regulated gene across the 4- and 12-hour samples. With the disappearance of the down-regulation in older samples we don’t know the point at which the infection stops having the affect on the gene. There could be a key time frame in which ACE2 has to stay suppressed for the virus to establish itself.</w:t>
       </w:r>
     </w:p>
     <w:p>
@@ -1763,7 +1727,7 @@
           <w:bCs/>
           <w:lang w:val="en-GB"/>
         </w:rPr>
-        <w:t>. A greater sample size would give us a better insight into the variance we’re seeing across the infected 4- 12-hour DEGs.</w:t>
+        <w:t xml:space="preserve">. A greater sample size would give us a better insight into the variance we’re seeing across the infected 4- 12-hour DEGs. </w:t>
       </w:r>
     </w:p>
     <w:p>

</xml_diff>